<commit_message>
docs: actualizar entregables SEM01-SEM04 eliminando supabase/figma y sincronizando edt/gantt
</commit_message>
<xml_diff>
--- a/docs/entregables/SEM01/acta_constitucion.docx
+++ b/docs/entregables/SEM01/acta_constitucion.docx
@@ -728,14 +728,7 @@
               <w:jc w:val="both"/>
             </w:pPr>
             <w:r>
-              <w:rPr>
-                <w:rFonts w:ascii="Arial" w:hAnsi="Arial"/>
-                <w:b w:val="0"/>
-                <w:i w:val="0"/>
-                <w:color w:val="000000"/>
-                <w:sz w:val="19"/>
-              </w:rPr>
-              <w:t>El proyecto se desarrollará bajo la metodología ágil Scrum para la sincronización operativa en taller. Se implementará una arquitectura web distribuida compuesta por un cliente SPA en Angular 21, una API RESTful asíncrona en FastAPI (Python 3.11), base de datos relacional transaccional en PostgreSQL, y módulos analíticos y predictivos en Scikit-learn y Prophet. El despliegue de backend y base de datos se estructurará sobre contenedores Docker alojados en servicios de nube optimizados (Cloud Run). La ejecución se distribuirá en sprints quincenales orientados a la entrega de procesos de negocio funcionales y verificables directamente en las estaciones de trabajo de la empresa.</w:t>
+              <w:t>El proyecto se desarrollará bajo la metodología ágil Scrum para la sincronización operativa en taller. Se implementará una arquitectura web distribuida compuesta por un cliente SPA en Angular 21, una API RESTful asíncrona en FastAPI (Python 3.11), base de datos relacional transaccional en PostgreSQL, y módulos analíticos y predictivos en Scikit-learn y Prophet. El despliegue de backend y base de datos se estructurará sobre contenedores Docker planificando el alojamiento en produccin sobre un servidor VPS particular propio (semana 11), operando en fases preliminares bajo entorno Docker local sin despliegues tempranos. La ejecución se distribuirá en sprints quincenales orientados a la entrega de procesos de negocio funcionales y verificables directamente en las estaciones de trabajo de la empresa.</w:t>
             </w:r>
           </w:p>
           <w:p>

</xml_diff>

<commit_message>
docs: actualizar documentacion de entregables semanas 1 a 8 y T1
</commit_message>
<xml_diff>
--- a/docs/entregables/SEM01/acta_constitucion.docx
+++ b/docs/entregables/SEM01/acta_constitucion.docx
@@ -497,7 +497,7 @@
                 <w:color w:val="000000"/>
                 <w:sz w:val="19"/>
               </w:rPr>
-              <w:t>Implementar un sistema web transaccional con módulos de inteligencia de negocios e inteligencia artificial para la optimización de los procesos operativos y financieros en la empresa Impresos Trujillo E.I.R.L.</w:t>
+              <w:t>Implementar un sistema web transaccional con módulos de inteligencia de negocios e inteligencia artificial para la optimización de los procesos operativos en la empresa Impresos Trujillo E.I.R.L.</w:t>
             </w:r>
           </w:p>
           <w:p>
@@ -728,7 +728,7 @@
               <w:jc w:val="both"/>
             </w:pPr>
             <w:r>
-              <w:t>El proyecto se desarrollará bajo la metodología ágil Scrum para la sincronización operativa en taller. Se implementará una arquitectura web distribuida compuesta por un cliente SPA en Angular 21, una API RESTful asíncrona en FastAPI (Python 3.11), base de datos relacional transaccional en PostgreSQL, y módulos analíticos y predictivos en Scikit-learn y Prophet. El despliegue de backend y base de datos se estructurará sobre contenedores Docker planificando el alojamiento en produccin sobre un servidor VPS particular propio (semana 11), operando en fases preliminares bajo entorno Docker local sin despliegues tempranos. La ejecución se distribuirá en sprints quincenales orientados a la entrega de procesos de negocio funcionales y verificables directamente en las estaciones de trabajo de la empresa.</w:t>
+              <w:t>El proyecto se desarrollará bajo la metodología ágil Scrum para la sincronización operativa en taller. Se implementará una arquitectura web distribuida compuesta por un cliente SPA en Angular 21, una API RESTful asíncrona en FastAPI (Python 3.11), base de datos relacional transaccional en PostgreSQL, y módulos analíticos y predictivos en Scikit-learn y Prophet. El despliegue de backend y base de datos se estructurará sobre contenedores Docker en un servidor VPS particular propio con pipeline de integración continua (CI/CD) automatizado mediante GitHub Actions, permitiendo validaciones en entorno local y despliegues verificados a producción. La ejecución se distribuirá en sprints quincenales orientados a la entrega de procesos de negocio funcionales y verificables directamente en las estaciones de trabajo de la empresa.</w:t>
             </w:r>
           </w:p>
           <w:p>
@@ -1283,7 +1283,7 @@
                       <w:rFonts w:ascii="Arial" w:hAnsi="Arial"/>
                       <w:sz w:val="16"/>
                     </w:rPr>
-                    <w:t>Arquitectura Cloud Run, modelo relacional PostgreSQL y prototipos UI/UX en Figma validados.</w:t>
+                    <w:t>Arquitectura de contenedores Docker en servidor VPS propio, modelo relacional PostgreSQL y componentes de interfaz en código Angular 21 validados.</w:t>
                   </w:r>
                 </w:p>
               </w:tc>
@@ -1917,7 +1917,7 @@
                       <w:rFonts w:ascii="Arial" w:hAnsi="Arial"/>
                       <w:sz w:val="16"/>
                     </w:rPr>
-                    <w:t>Alojamiento en la nube (Cloud Run y PostgreSQL gestionado en Supabase - plan proyecto)</w:t>
+                    <w:t>Alojamiento en Servidor VPS particular propio y base de datos PostgreSQL nativa en contenedor Docker</w:t>
                   </w:r>
                 </w:p>
               </w:tc>
@@ -4366,7 +4366,7 @@
                       <w:rFonts w:ascii="Arial" w:hAnsi="Arial"/>
                       <w:sz w:val="16"/>
                     </w:rPr>
-                    <w:t>• Ingeniero DevOps y Cloud (Docker, CI/CD y Cloud Run)</w:t>
+                    <w:t>• Ingeniero DevOps (Docker Compose, CI/CD con GitHub Actions y Servidor VPS propio)</w:t>
                   </w:r>
                 </w:p>
               </w:tc>
@@ -4456,7 +4456,7 @@
                       <w:rFonts w:ascii="Arial" w:hAnsi="Arial"/>
                       <w:sz w:val="16"/>
                     </w:rPr>
-                    <w:t>• Diseñador UI/UX y Prototipado de Interfaces</w:t>
+                    <w:t>• Maquetador UI/UX y Prototipado en Código (Angular 21)</w:t>
                   </w:r>
                 </w:p>
                 <w:p>

</xml_diff>